<commit_message>
Add Mode 4 (AI-Drafted Spec) to the SCVHS research paper
Mirrors the Mode 4 addition already made to the markdown methodology
docs. Updates the mode count from three to four in the abstract,
contributions list, and Section 4.1/4.3 headings; adds a full Mode 4
subsection to Section 4.3 alongside Modes 1-3 (Construction, Specify,
Comprehension Primitive, Validate activity, Agent Failure Modes list,
When to apply, Examples, Distinguishing feature from Mode 3); adds a
note to the Mode 1/2/3 Scaffolding Comparison table explaining why
Mode 4 isn't a fourth column; and adds a note to Section 4.6 clarifying
Mode 4 sits outside the three-principle scaffolding-fade model as a
narrow, opt-in, instructor-gated exception, not a further rung on the
Mode 1-3 ladder. Lightly qualifies the two AI-DLC comparison table
cells that describe the three-mode scaffolding fade so they read
consistently with the rest of the paper.
</commit_message>
<xml_diff>
--- a/docs/SCVHS_Research_Paper_v1.docx
+++ b/docs/SCVHS_Research_Paper_v1.docx
@@ -189,7 +189,7 @@
         <w:rPr>
           <w:rFonts w:ascii="Calibri" w:hAnsi="Calibri" w:cs="Calibri"/>
         </w:rPr>
-        <w:t xml:space="preserve"> (Specify, Construct, Validate, Harden, Ship), a five-phase, mode-adaptive methodology for AI-assisted professional work in any domain where human ownership of AI-constructed artifacts is required. SCVHS is presented here in a software engineering education context, which constitutes its primary empirical deployment. The five phases, three operating modes, and two core artifacts are domain-agnostic and are intended for generalization beyond engineering. SCVHS addresses the comprehension gap through three mechanisms: specification-first design discipline, the </w:t>
+        <w:t xml:space="preserve"> (Specify, Construct, Validate, Harden, Ship), a five-phase, mode-adaptive methodology for AI-assisted professional work in any domain where human ownership of AI-constructed artifacts is required. SCVHS is presented here in a software engineering education context, which constitutes its primary empirical deployment. The five phases, four operating modes, and two core artifacts are domain-agnostic and are intended for generalization beyond engineering. SCVHS addresses the comprehension gap through three mechanisms: specification-first design discipline, the </w:t>
       </w:r>
       <w:r>
         <w:rPr>
@@ -717,8 +717,7 @@
         <w:rPr>
           <w:rFonts w:ascii="Calibri" w:hAnsi="Calibri" w:cs="Calibri"/>
         </w:rPr>
-        <w:lastRenderedPageBreak/>
-        <w:t>Formal specification of the SCVHS five-phase pipeline and three operating modes, with domain-agnostic definitions.</w:t>
+        <w:t>Formal specification of the SCVHS five-phase pipeline and four operating modes, with domain-agnostic definitions.</w:t>
       </w:r>
     </w:p>
     <w:p>
@@ -4439,7 +4438,7 @@
         <w:rPr>
           <w:rFonts w:ascii="Calibri" w:hAnsi="Calibri" w:cs="Calibri"/>
         </w:rPr>
-        <w:t>SCVHS is a five-phase engineering workflow with three operating modes. The phases are invariant - every sprint runs all five. The mode determines who performs the Construct phase and what scaffolding is provided in the Validate phase.</w:t>
+        <w:t>SCVHS is a five-phase engineering workflow with four operating modes. The phases are invariant - every sprint runs all five. The mode determines who performs the Construct phase and what scaffolding is provided in the Validate phase.</w:t>
       </w:r>
     </w:p>
     <w:p>
@@ -4490,7 +4489,7 @@
           <w:b/>
           <w:bCs/>
         </w:rPr>
-        <w:t>The Three Modes:</w:t>
+        <w:t>The Four Modes:</w:t>
       </w:r>
     </w:p>
     <w:p>
@@ -4507,7 +4506,7 @@
           <w:sz w:val="18"/>
           <w:szCs w:val="18"/>
         </w:rPr>
-        <w:t>Mode 1: Hand-First + Validate AI Mode 2: Hybrid / Generate-then-Explain Mode 3: Full SCVHS</w:t>
+        <w:t>Mode 1: Hand-First + Validate AI Mode 2: Hybrid / Generate-then-Explain Mode 3: Full SCVHS Mode 4: AI-Drafted Spec (Advanced)</w:t>
       </w:r>
     </w:p>
     <w:p>
@@ -4955,7 +4954,7 @@
         <w:rPr>
           <w:rFonts w:ascii="Calibri" w:hAnsi="Calibri" w:cs="Calibri"/>
         </w:rPr>
-        <w:t>The Comprehension Primitive (Section 4.4) is completed before AI construction begins in Modes 2 and 3.</w:t>
+        <w:t>The Comprehension Primitive (Section 4.4) is completed before AI construction begins in Modes 2, 3, and 4.</w:t>
       </w:r>
     </w:p>
     <w:p>
@@ -5485,8 +5484,7 @@
           <w:rFonts w:ascii="Calibri" w:hAnsi="Calibri" w:cs="Calibri"/>
           <w:color w:val="000000" w:themeColor="text1"/>
         </w:rPr>
-        <w:lastRenderedPageBreak/>
-        <w:t>4.3 The Three Modes</w:t>
+        <w:t>4.3 The Four Modes</w:t>
       </w:r>
     </w:p>
     <w:p>
@@ -5503,6 +5501,13 @@
         </w:rPr>
         <w:t>The SCVHS mode determines who constructs and what scaffolding exists in Validate. The mode is declared in the header of every Spec file.</w:t>
       </w:r>
+      <w:r>
+        <w:rPr>
+          <w:rFonts w:ascii="Calibri" w:hAnsi="Calibri"/>
+          <w:b w:val="0"/>
+        </w:rPr>
+        <w:t xml:space="preserve"> Mode 4 additionally changes who performs Specify; see below.</w:t>
+      </w:r>
     </w:p>
     <w:p>
       <w:pPr>
@@ -6118,6 +6123,154 @@
           <w:rFonts w:ascii="Calibri" w:hAnsi="Calibri" w:cs="Calibri"/>
         </w:rPr>
         <w:t xml:space="preserve"> In assessment sprints, AI is permitted as a reference tool only. Construction is by hand. The engineer must be able to explain and modify every line on demand during the review session.</w:t>
+      </w:r>
+    </w:p>
+    <w:p>
+      <w:pPr>
+        <w:pStyle w:val="Heading3"/>
+      </w:pPr>
+      <w:r>
+        <w:rPr>
+          <w:rFonts w:ascii="Calibri" w:hAnsi="Calibri"/>
+          <w:b w:val="0"/>
+        </w:rPr>
+        <w:t>Mode 4: AI-Drafted Spec (Advanced)</w:t>
+      </w:r>
+    </w:p>
+    <w:p>
+      <w:pPr/>
+      <w:r>
+        <w:rPr>
+          <w:rFonts w:ascii="Calibri" w:hAnsi="Calibri"/>
+          <w:b/>
+        </w:rPr>
+        <w:t>Construction:</w:t>
+      </w:r>
+      <w:r>
+        <w:rPr>
+          <w:rFonts w:ascii="Calibri" w:hAnsi="Calibri"/>
+          <w:b w:val="0"/>
+        </w:rPr>
+        <w:t xml:space="preserve"> Same as Mode 3: the AI tool constructs the artifact, directed by the spec.</w:t>
+      </w:r>
+    </w:p>
+    <w:p>
+      <w:pPr/>
+      <w:r>
+        <w:rPr>
+          <w:rFonts w:ascii="Calibri" w:hAnsi="Calibri"/>
+          <w:b/>
+        </w:rPr>
+        <w:t>Specify:</w:t>
+      </w:r>
+      <w:r>
+        <w:rPr>
+          <w:rFonts w:ascii="Calibri" w:hAnsi="Calibri"/>
+          <w:b w:val="0"/>
+        </w:rPr>
+        <w:t xml:space="preserve"> Unlike Modes 1 through 3, the learner does not author the spec's first draft. An AI tool drafts Spec_S0N_[Title].md from three inputs: the sprint README, a generic spec-creation prompt, and a raw spec template. The learner reviews the draft using the same checklist a content developer applies to an AI-drafted reference spec, edits it until it is correct, and commits it as their own spec. An unreviewed AI draft is not a valid Mode 4 spec.</w:t>
+      </w:r>
+    </w:p>
+    <w:p>
+      <w:pPr/>
+      <w:r>
+        <w:rPr>
+          <w:rFonts w:ascii="Calibri" w:hAnsi="Calibri"/>
+          <w:b/>
+        </w:rPr>
+        <w:t>Comprehension Primitive:</w:t>
+      </w:r>
+      <w:r>
+        <w:rPr>
+          <w:rFonts w:ascii="Calibri" w:hAnsi="Calibri"/>
+          <w:b w:val="0"/>
+        </w:rPr>
+        <w:t xml:space="preserve"> Required. Same as Mode 2 and Mode 3.</w:t>
+      </w:r>
+    </w:p>
+    <w:p>
+      <w:pPr/>
+      <w:r>
+        <w:rPr>
+          <w:rFonts w:ascii="Calibri" w:hAnsi="Calibri"/>
+          <w:b/>
+        </w:rPr>
+        <w:t>Validate activity:</w:t>
+      </w:r>
+      <w:r>
+        <w:rPr>
+          <w:rFonts w:ascii="Calibri" w:hAnsi="Calibri"/>
+          <w:b w:val="0"/>
+        </w:rPr>
+        <w:t xml:space="preserve"> Identical to Mode 3. The Decision Log records a pass or fail for every construct; only defective constructs require a full entry. The spec being AI-drafted does not relax this: the learner validates against a spec they reviewed and signed off on, not against the AI's intentions.</w:t>
+      </w:r>
+    </w:p>
+    <w:p>
+      <w:pPr/>
+      <w:r>
+        <w:rPr>
+          <w:rFonts w:ascii="Calibri" w:hAnsi="Calibri"/>
+          <w:b/>
+        </w:rPr>
+        <w:t>Agent Failure Modes list:</w:t>
+      </w:r>
+      <w:r>
+        <w:rPr>
+          <w:rFonts w:ascii="Calibri" w:hAnsi="Calibri"/>
+          <w:b w:val="0"/>
+        </w:rPr>
+        <w:t xml:space="preserve"> NOT provided. Same as Mode 3.</w:t>
+      </w:r>
+    </w:p>
+    <w:p>
+      <w:pPr/>
+      <w:r>
+        <w:rPr>
+          <w:rFonts w:ascii="Calibri" w:hAnsi="Calibri"/>
+          <w:b/>
+        </w:rPr>
+        <w:t>When to apply:</w:t>
+      </w:r>
+      <w:r>
+        <w:rPr>
+          <w:rFonts w:ascii="Calibri" w:hAnsi="Calibri"/>
+          <w:b w:val="0"/>
+        </w:rPr>
+        <w:t xml:space="preserve"> Mode 4 is a narrow, instructor-gated exception, not a destination every learner reaches. It is reserved for advanced developers who have already operated in Mode 3 for this technology across multiple prior sprints and have demonstrated they can write a precise spec independently, and for tracks where directing AI-assisted spec drafting is itself the skill being taught. It is not a remedy for learners who find spec-writing hard: a learner who cannot yet write a Mode 3 spec independently needs more Mode 2/3 practice, not Mode 4.</w:t>
+      </w:r>
+    </w:p>
+    <w:p>
+      <w:pPr/>
+      <w:r>
+        <w:rPr>
+          <w:rFonts w:ascii="Calibri" w:hAnsi="Calibri"/>
+          <w:b/>
+        </w:rPr>
+        <w:t>Examples:</w:t>
+      </w:r>
+      <w:r>
+        <w:rPr>
+          <w:rFonts w:ascii="Calibri" w:hAnsi="Calibri"/>
+          <w:b w:val="0"/>
+        </w:rPr>
+        <w:t xml:space="preserve"> An advanced or capstone sprint where the learner directs an AI tool through the full pipeline, including spec drafting, to simulate a production AI-native engineering workflow; a sprint explicitly designed to teach AI-assisted specification as a skill in its own right, for learners who have already mastered manual specification in Mode 3.</w:t>
+      </w:r>
+    </w:p>
+    <w:p>
+      <w:pPr/>
+      <w:r>
+        <w:rPr>
+          <w:rFonts w:ascii="Calibri" w:hAnsi="Calibri"/>
+          <w:b/>
+        </w:rPr>
+        <w:t>Distinguishing feature from Mode 3:</w:t>
+      </w:r>
+      <w:r>
+        <w:rPr>
+          <w:rFonts w:ascii="Calibri" w:hAnsi="Calibri"/>
+          <w:b w:val="0"/>
+        </w:rPr>
+        <w:t xml:space="preserve"> who drafts the spec's first version. Construct, Validate, and the Decision Log are identical to Mode 3; only Specify differs.</w:t>
       </w:r>
     </w:p>
     <w:p>
@@ -7047,6 +7200,16 @@
       </w:pPr>
     </w:p>
     <w:p>
+      <w:pPr/>
+      <w:r>
+        <w:rPr>
+          <w:rFonts w:ascii="Calibri" w:hAnsi="Calibri"/>
+          <w:b w:val="0"/>
+        </w:rPr>
+        <w:t>Mode 4 is not shown as a column above because, on every dimension in this table, it is identical to Mode 3: same construction actor, same Comprehension Primitive requirement, no Agent Failure Modes list, same Decision Log rules, same artifact shipped, same primary cognitive activity in Validate. The one dimension this table does not capture is who authors the spec: Modes 1 through 3 all require learner authorship; Mode 4 has the AI tool draft it, with the learner reviewing and finalizing it before it directs construction.</w:t>
+      </w:r>
+    </w:p>
+    <w:p>
       <w:pPr>
         <w:pStyle w:val="Heading3"/>
       </w:pPr>
@@ -9344,6 +9507,23 @@
           <w:rFonts w:ascii="Calibri" w:hAnsi="Calibri" w:cs="Calibri"/>
         </w:rPr>
         <w:t xml:space="preserve"> What does not change as mode advances is the requirement for the learner to think: to specify, to explain, to validate, to own. What changes is the proportion of construction done by hand versus by AI, and the degree of scaffolding provided in Validate.</w:t>
+      </w:r>
+    </w:p>
+    <w:p>
+      <w:pPr/>
+      <w:r>
+        <w:rPr>
+          <w:rFonts w:ascii="Calibri" w:hAnsi="Calibri"/>
+          <w:b/>
+        </w:rPr>
+        <w:t>Mode 4 is not part of this three-principle model.</w:t>
+      </w:r>
+      <w:r>
+        <w:rPr>
+          <w:rFonts w:ascii="Calibri" w:hAnsi="Calibri"/>
+          <w:b w:val="0"/>
+        </w:rPr>
+        <w:t xml:space="preserve"> It is a narrow, opt-in, instructor-gated exception layered on top of Mode 3 eligibility that fades a different phase (Specify) rather than a further increment of Construct/Validate scaffolding. It is available only to learners who have already demonstrated independent Mode 3 spec-writing for a technology, and only when a content developer or instructor deliberately opts a sprint into it. Most learners complete a course entirely within Modes 1 through 3; that is the expected outcome, not a gap. See Section 4.3.</w:t>
       </w:r>
     </w:p>
     <w:p>
@@ -14969,7 +15149,7 @@
               <w:rPr>
                 <w:rFonts w:ascii="Calibri" w:hAnsi="Calibri" w:cs="Calibri"/>
               </w:rPr>
-              <w:t>Three-mode scaffolding fade</w:t>
+              <w:t>Three-mode scaffolding fade (plus an opt-in advanced Mode 4)</w:t>
             </w:r>
           </w:p>
         </w:tc>
@@ -16707,7 +16887,7 @@
               <w:rPr>
                 <w:rFonts w:ascii="Calibri" w:hAnsi="Calibri" w:cs="Calibri"/>
               </w:rPr>
-              <w:t>Structured progression of support from Mode 1 to Mode 3</w:t>
+              <w:t>Structured progression of support from Mode 1 to Mode 3 (plus an opt-in advanced Mode 4)</w:t>
             </w:r>
           </w:p>
         </w:tc>

</xml_diff>

<commit_message>
Give Mode 4 a real column in the Scaffolding Comparison table
Mode 4 was previously documented only in prose, with a note explaining
why it wasn't shown in the Mode 1/2/3 Scaffolding Comparison table.
Replaces that with an actual Mode 4 column, and adds a "Who specifies"
row so the table shows the one dimension where Mode 4 genuinely
differs from Mode 3 (the AI drafts the spec; the learner reviews and
finalizes it) rather than looking identical to Mode 3 with no
explanation. Removes the now-obsolete prose note.
</commit_message>
<xml_diff>
--- a/docs/SCVHS_Research_Paper_v1.docx
+++ b/docs/SCVHS_Research_Paper_v1.docx
@@ -6305,10 +6305,11 @@
         <w:tblLook w:val="0000" w:firstRow="0" w:lastRow="0" w:firstColumn="0" w:lastColumn="0" w:noHBand="0" w:noVBand="0"/>
       </w:tblPr>
       <w:tblGrid>
-        <w:gridCol w:w="2256"/>
-        <w:gridCol w:w="2256"/>
-        <w:gridCol w:w="2257"/>
-        <w:gridCol w:w="2257"/>
+        <w:gridCol w:w="1800"/>
+        <w:gridCol w:w="1807"/>
+        <w:gridCol w:w="1807"/>
+        <w:gridCol w:w="1806"/>
+        <w:gridCol w:w="1806"/>
       </w:tblGrid>
       <w:tr>
         <w:trPr>
@@ -6316,7 +6317,7 @@
         </w:trPr>
         <w:tc>
           <w:tcPr>
-            <w:tcW w:w="2256" w:type="dxa"/>
+            <w:tcW w:w="1800" w:type="dxa"/>
             <w:tcBorders>
               <w:top w:val="single" w:sz="1" w:space="0" w:color="CCCCCC"/>
               <w:left w:val="single" w:sz="1" w:space="0" w:color="CCCCCC"/>
@@ -6345,7 +6346,7 @@
         </w:tc>
         <w:tc>
           <w:tcPr>
-            <w:tcW w:w="2256" w:type="dxa"/>
+            <w:tcW w:w="1807" w:type="dxa"/>
             <w:tcBorders>
               <w:top w:val="single" w:sz="1" w:space="0" w:color="CCCCCC"/>
               <w:left w:val="single" w:sz="1" w:space="0" w:color="CCCCCC"/>
@@ -6383,7 +6384,7 @@
         </w:tc>
         <w:tc>
           <w:tcPr>
-            <w:tcW w:w="2256" w:type="dxa"/>
+            <w:tcW w:w="1807" w:type="dxa"/>
             <w:tcBorders>
               <w:top w:val="single" w:sz="1" w:space="0" w:color="CCCCCC"/>
               <w:left w:val="single" w:sz="1" w:space="0" w:color="CCCCCC"/>
@@ -6421,7 +6422,7 @@
         </w:tc>
         <w:tc>
           <w:tcPr>
-            <w:tcW w:w="2256" w:type="dxa"/>
+            <w:tcW w:w="1806" w:type="dxa"/>
             <w:tcBorders>
               <w:top w:val="single" w:sz="1" w:space="0" w:color="CCCCCC"/>
               <w:left w:val="single" w:sz="1" w:space="0" w:color="CCCCCC"/>
@@ -6457,125 +6458,193 @@
             </w:r>
           </w:p>
         </w:tc>
+        <w:tc>
+          <w:tcPr>
+            <w:tcW w:w="1806" w:type="dxa"/>
+            <w:tcBorders>
+              <w:top w:val="single" w:sz="1" w:space="0" w:color="CCCCCC"/>
+              <w:left w:val="single" w:sz="1" w:space="0" w:color="CCCCCC"/>
+              <w:bottom w:val="single" w:sz="1" w:space="0" w:color="CCCCCC"/>
+              <w:right w:val="single" w:sz="1" w:space="0" w:color="CCCCCC"/>
+            </w:tcBorders>
+            <w:shd w:val="clear" w:color="auto" w:fill="D9D9D9" w:themeFill="background1" w:themeFillShade="D9"/>
+            <w:tcMar>
+              <w:top w:w="80" w:type="dxa"/>
+              <w:left w:w="120" w:type="dxa"/>
+              <w:bottom w:w="80" w:type="dxa"/>
+              <w:right w:w="120" w:type="dxa"/>
+            </w:tcMar>
+          </w:tcPr>
+          <w:p>
+            <w:pPr>
+              <w:jc w:val="center"/>
+              <w:rPr>
+                <w:rFonts w:ascii="Calibri" w:hAnsi="Calibri" w:cs="Calibri"/>
+                <w:b/>
+                <w:bCs/>
+                <w:color w:val="000000" w:themeColor="text1"/>
+              </w:rPr>
+            </w:pPr>
+            <w:r>
+              <w:rPr>
+                <w:rFonts w:ascii="Calibri" w:hAnsi="Calibri" w:cs="Calibri"/>
+                <w:b/>
+                <w:bCs/>
+                <w:color w:val="000000" w:themeColor="text1"/>
+              </w:rPr>
+              <w:t xml:space="preserve">Mode 4</w:t>
+            </w:r>
+          </w:p>
+        </w:tc>
       </w:tr>
       <w:tr>
         <w:tc>
           <w:tcPr>
-            <w:tcW w:w="2256" w:type="dxa"/>
-            <w:tcBorders>
-              <w:top w:val="single" w:sz="1" w:space="0" w:color="CCCCCC"/>
-              <w:left w:val="single" w:sz="1" w:space="0" w:color="CCCCCC"/>
-              <w:bottom w:val="single" w:sz="1" w:space="0" w:color="CCCCCC"/>
-              <w:right w:val="single" w:sz="1" w:space="0" w:color="CCCCCC"/>
-            </w:tcBorders>
-            <w:tcMar>
-              <w:top w:w="80" w:type="dxa"/>
-              <w:left w:w="120" w:type="dxa"/>
-              <w:bottom w:w="80" w:type="dxa"/>
-              <w:right w:w="120" w:type="dxa"/>
-            </w:tcMar>
-          </w:tcPr>
-          <w:p>
-            <w:pPr>
-              <w:rPr>
-                <w:rFonts w:ascii="Calibri" w:hAnsi="Calibri" w:cs="Calibri"/>
-              </w:rPr>
-            </w:pPr>
-            <w:r>
-              <w:rPr>
-                <w:rFonts w:ascii="Calibri" w:hAnsi="Calibri" w:cs="Calibri"/>
-              </w:rPr>
-              <w:t>Who constructs</w:t>
-            </w:r>
-          </w:p>
-        </w:tc>
-        <w:tc>
-          <w:tcPr>
-            <w:tcW w:w="2256" w:type="dxa"/>
-            <w:tcBorders>
-              <w:top w:val="single" w:sz="1" w:space="0" w:color="CCCCCC"/>
-              <w:left w:val="single" w:sz="1" w:space="0" w:color="CCCCCC"/>
-              <w:bottom w:val="single" w:sz="1" w:space="0" w:color="CCCCCC"/>
-              <w:right w:val="single" w:sz="1" w:space="0" w:color="CCCCCC"/>
-            </w:tcBorders>
-            <w:tcMar>
-              <w:top w:w="80" w:type="dxa"/>
-              <w:left w:w="120" w:type="dxa"/>
-              <w:bottom w:w="80" w:type="dxa"/>
-              <w:right w:w="120" w:type="dxa"/>
-            </w:tcMar>
-          </w:tcPr>
-          <w:p>
-            <w:pPr>
-              <w:rPr>
-                <w:rFonts w:ascii="Calibri" w:hAnsi="Calibri" w:cs="Calibri"/>
-              </w:rPr>
-            </w:pPr>
-            <w:r>
-              <w:rPr>
-                <w:rFonts w:ascii="Calibri" w:hAnsi="Calibri" w:cs="Calibri"/>
-              </w:rPr>
-              <w:t>Learner by hand</w:t>
-            </w:r>
-          </w:p>
-        </w:tc>
-        <w:tc>
-          <w:tcPr>
-            <w:tcW w:w="2256" w:type="dxa"/>
-            <w:tcBorders>
-              <w:top w:val="single" w:sz="1" w:space="0" w:color="CCCCCC"/>
-              <w:left w:val="single" w:sz="1" w:space="0" w:color="CCCCCC"/>
-              <w:bottom w:val="single" w:sz="1" w:space="0" w:color="CCCCCC"/>
-              <w:right w:val="single" w:sz="1" w:space="0" w:color="CCCCCC"/>
-            </w:tcBorders>
-            <w:tcMar>
-              <w:top w:w="80" w:type="dxa"/>
-              <w:left w:w="120" w:type="dxa"/>
-              <w:bottom w:w="80" w:type="dxa"/>
-              <w:right w:w="120" w:type="dxa"/>
-            </w:tcMar>
-          </w:tcPr>
-          <w:p>
-            <w:pPr>
-              <w:rPr>
-                <w:rFonts w:ascii="Calibri" w:hAnsi="Calibri" w:cs="Calibri"/>
-              </w:rPr>
-            </w:pPr>
-            <w:r>
-              <w:rPr>
-                <w:rFonts w:ascii="Calibri" w:hAnsi="Calibri" w:cs="Calibri"/>
-              </w:rPr>
-              <w:t>AI tool</w:t>
-            </w:r>
-          </w:p>
-        </w:tc>
-        <w:tc>
-          <w:tcPr>
-            <w:tcW w:w="2256" w:type="dxa"/>
-            <w:tcBorders>
-              <w:top w:val="single" w:sz="1" w:space="0" w:color="CCCCCC"/>
-              <w:left w:val="single" w:sz="1" w:space="0" w:color="CCCCCC"/>
-              <w:bottom w:val="single" w:sz="1" w:space="0" w:color="CCCCCC"/>
-              <w:right w:val="single" w:sz="1" w:space="0" w:color="CCCCCC"/>
-            </w:tcBorders>
-            <w:tcMar>
-              <w:top w:w="80" w:type="dxa"/>
-              <w:left w:w="120" w:type="dxa"/>
-              <w:bottom w:w="80" w:type="dxa"/>
-              <w:right w:w="120" w:type="dxa"/>
-            </w:tcMar>
-          </w:tcPr>
-          <w:p>
-            <w:pPr>
-              <w:rPr>
-                <w:rFonts w:ascii="Calibri" w:hAnsi="Calibri" w:cs="Calibri"/>
-              </w:rPr>
-            </w:pPr>
-            <w:r>
-              <w:rPr>
-                <w:rFonts w:ascii="Calibri" w:hAnsi="Calibri" w:cs="Calibri"/>
-              </w:rPr>
-              <w:t>AI tool</w:t>
+            <w:tcW w:w="1800" w:type="dxa"/>
+            <w:tcBorders>
+              <w:top w:val="single" w:sz="1" w:space="0" w:color="CCCCCC"/>
+              <w:left w:val="single" w:sz="1" w:space="0" w:color="CCCCCC"/>
+              <w:bottom w:val="single" w:sz="1" w:space="0" w:color="CCCCCC"/>
+              <w:right w:val="single" w:sz="1" w:space="0" w:color="CCCCCC"/>
+            </w:tcBorders>
+            <w:tcMar>
+              <w:top w:w="80" w:type="dxa"/>
+              <w:left w:w="120" w:type="dxa"/>
+              <w:bottom w:w="80" w:type="dxa"/>
+              <w:right w:w="120" w:type="dxa"/>
+            </w:tcMar>
+          </w:tcPr>
+          <w:p>
+            <w:pPr>
+              <w:rPr>
+                <w:rFonts w:ascii="Calibri" w:hAnsi="Calibri" w:cs="Calibri"/>
+              </w:rPr>
+            </w:pPr>
+            <w:r>
+              <w:rPr>
+                <w:rFonts w:ascii="Calibri" w:hAnsi="Calibri" w:cs="Calibri"/>
+              </w:rPr>
+              <w:t xml:space="preserve">Who specifies</w:t>
+            </w:r>
+          </w:p>
+        </w:tc>
+        <w:tc>
+          <w:tcPr>
+            <w:tcW w:w="1807" w:type="dxa"/>
+            <w:tcBorders>
+              <w:top w:val="single" w:sz="1" w:space="0" w:color="CCCCCC"/>
+              <w:left w:val="single" w:sz="1" w:space="0" w:color="CCCCCC"/>
+              <w:bottom w:val="single" w:sz="1" w:space="0" w:color="CCCCCC"/>
+              <w:right w:val="single" w:sz="1" w:space="0" w:color="CCCCCC"/>
+            </w:tcBorders>
+            <w:tcMar>
+              <w:top w:w="80" w:type="dxa"/>
+              <w:left w:w="120" w:type="dxa"/>
+              <w:bottom w:w="80" w:type="dxa"/>
+              <w:right w:w="120" w:type="dxa"/>
+            </w:tcMar>
+          </w:tcPr>
+          <w:p>
+            <w:pPr>
+              <w:rPr>
+                <w:rFonts w:ascii="Calibri" w:hAnsi="Calibri" w:cs="Calibri"/>
+              </w:rPr>
+            </w:pPr>
+            <w:r>
+              <w:rPr>
+                <w:rFonts w:ascii="Calibri" w:hAnsi="Calibri" w:cs="Calibri"/>
+              </w:rPr>
+              <w:t xml:space="preserve">Learner</w:t>
+            </w:r>
+          </w:p>
+        </w:tc>
+        <w:tc>
+          <w:tcPr>
+            <w:tcW w:w="1807" w:type="dxa"/>
+            <w:tcBorders>
+              <w:top w:val="single" w:sz="1" w:space="0" w:color="CCCCCC"/>
+              <w:left w:val="single" w:sz="1" w:space="0" w:color="CCCCCC"/>
+              <w:bottom w:val="single" w:sz="1" w:space="0" w:color="CCCCCC"/>
+              <w:right w:val="single" w:sz="1" w:space="0" w:color="CCCCCC"/>
+            </w:tcBorders>
+            <w:tcMar>
+              <w:top w:w="80" w:type="dxa"/>
+              <w:left w:w="120" w:type="dxa"/>
+              <w:bottom w:w="80" w:type="dxa"/>
+              <w:right w:w="120" w:type="dxa"/>
+            </w:tcMar>
+          </w:tcPr>
+          <w:p>
+            <w:pPr>
+              <w:rPr>
+                <w:rFonts w:ascii="Calibri" w:hAnsi="Calibri" w:cs="Calibri"/>
+              </w:rPr>
+            </w:pPr>
+            <w:r>
+              <w:rPr>
+                <w:rFonts w:ascii="Calibri" w:hAnsi="Calibri" w:cs="Calibri"/>
+              </w:rPr>
+              <w:t xml:space="preserve">Learner</w:t>
+            </w:r>
+          </w:p>
+        </w:tc>
+        <w:tc>
+          <w:tcPr>
+            <w:tcW w:w="1806" w:type="dxa"/>
+            <w:tcBorders>
+              <w:top w:val="single" w:sz="1" w:space="0" w:color="CCCCCC"/>
+              <w:left w:val="single" w:sz="1" w:space="0" w:color="CCCCCC"/>
+              <w:bottom w:val="single" w:sz="1" w:space="0" w:color="CCCCCC"/>
+              <w:right w:val="single" w:sz="1" w:space="0" w:color="CCCCCC"/>
+            </w:tcBorders>
+            <w:tcMar>
+              <w:top w:w="80" w:type="dxa"/>
+              <w:left w:w="120" w:type="dxa"/>
+              <w:bottom w:w="80" w:type="dxa"/>
+              <w:right w:w="120" w:type="dxa"/>
+            </w:tcMar>
+          </w:tcPr>
+          <w:p>
+            <w:pPr>
+              <w:rPr>
+                <w:rFonts w:ascii="Calibri" w:hAnsi="Calibri" w:cs="Calibri"/>
+              </w:rPr>
+            </w:pPr>
+            <w:r>
+              <w:rPr>
+                <w:rFonts w:ascii="Calibri" w:hAnsi="Calibri" w:cs="Calibri"/>
+              </w:rPr>
+              <w:t xml:space="preserve">Learner</w:t>
+            </w:r>
+          </w:p>
+        </w:tc>
+        <w:tc>
+          <w:tcPr>
+            <w:tcW w:w="1806" w:type="dxa"/>
+            <w:tcBorders>
+              <w:top w:val="single" w:sz="1" w:space="0" w:color="CCCCCC"/>
+              <w:left w:val="single" w:sz="1" w:space="0" w:color="CCCCCC"/>
+              <w:bottom w:val="single" w:sz="1" w:space="0" w:color="CCCCCC"/>
+              <w:right w:val="single" w:sz="1" w:space="0" w:color="CCCCCC"/>
+            </w:tcBorders>
+            <w:tcMar>
+              <w:top w:w="80" w:type="dxa"/>
+              <w:left w:w="120" w:type="dxa"/>
+              <w:bottom w:w="80" w:type="dxa"/>
+              <w:right w:w="120" w:type="dxa"/>
+            </w:tcMar>
+          </w:tcPr>
+          <w:p>
+            <w:pPr>
+              <w:rPr>
+                <w:rFonts w:ascii="Calibri" w:hAnsi="Calibri" w:cs="Calibri"/>
+              </w:rPr>
+            </w:pPr>
+            <w:r>
+              <w:rPr>
+                <w:rFonts w:ascii="Calibri" w:hAnsi="Calibri" w:cs="Calibri"/>
+              </w:rPr>
+              <w:t xml:space="preserve">AI tool (drafted); learner reviews and finalizes</w:t>
             </w:r>
           </w:p>
         </w:tc>
@@ -6583,121 +6652,151 @@
       <w:tr>
         <w:tc>
           <w:tcPr>
-            <w:tcW w:w="2256" w:type="dxa"/>
-            <w:tcBorders>
-              <w:top w:val="single" w:sz="1" w:space="0" w:color="CCCCCC"/>
-              <w:left w:val="single" w:sz="1" w:space="0" w:color="CCCCCC"/>
-              <w:bottom w:val="single" w:sz="1" w:space="0" w:color="CCCCCC"/>
-              <w:right w:val="single" w:sz="1" w:space="0" w:color="CCCCCC"/>
-            </w:tcBorders>
-            <w:tcMar>
-              <w:top w:w="80" w:type="dxa"/>
-              <w:left w:w="120" w:type="dxa"/>
-              <w:bottom w:w="80" w:type="dxa"/>
-              <w:right w:w="120" w:type="dxa"/>
-            </w:tcMar>
-          </w:tcPr>
-          <w:p>
-            <w:pPr>
-              <w:rPr>
-                <w:rFonts w:ascii="Calibri" w:hAnsi="Calibri" w:cs="Calibri"/>
-              </w:rPr>
-            </w:pPr>
-            <w:r>
-              <w:rPr>
-                <w:rFonts w:ascii="Calibri" w:hAnsi="Calibri" w:cs="Calibri"/>
-              </w:rPr>
-              <w:t>Comprehension Primitive</w:t>
-            </w:r>
-          </w:p>
-        </w:tc>
-        <w:tc>
-          <w:tcPr>
-            <w:tcW w:w="2256" w:type="dxa"/>
-            <w:tcBorders>
-              <w:top w:val="single" w:sz="1" w:space="0" w:color="CCCCCC"/>
-              <w:left w:val="single" w:sz="1" w:space="0" w:color="CCCCCC"/>
-              <w:bottom w:val="single" w:sz="1" w:space="0" w:color="CCCCCC"/>
-              <w:right w:val="single" w:sz="1" w:space="0" w:color="CCCCCC"/>
-            </w:tcBorders>
-            <w:tcMar>
-              <w:top w:w="80" w:type="dxa"/>
-              <w:left w:w="120" w:type="dxa"/>
-              <w:bottom w:w="80" w:type="dxa"/>
-              <w:right w:w="120" w:type="dxa"/>
-            </w:tcMar>
-          </w:tcPr>
-          <w:p>
-            <w:pPr>
-              <w:rPr>
-                <w:rFonts w:ascii="Calibri" w:hAnsi="Calibri" w:cs="Calibri"/>
-              </w:rPr>
-            </w:pPr>
-            <w:r>
-              <w:rPr>
-                <w:rFonts w:ascii="Calibri" w:hAnsi="Calibri" w:cs="Calibri"/>
-              </w:rPr>
-              <w:t>No (learner IS constructing)</w:t>
-            </w:r>
-          </w:p>
-        </w:tc>
-        <w:tc>
-          <w:tcPr>
-            <w:tcW w:w="2256" w:type="dxa"/>
-            <w:tcBorders>
-              <w:top w:val="single" w:sz="1" w:space="0" w:color="CCCCCC"/>
-              <w:left w:val="single" w:sz="1" w:space="0" w:color="CCCCCC"/>
-              <w:bottom w:val="single" w:sz="1" w:space="0" w:color="CCCCCC"/>
-              <w:right w:val="single" w:sz="1" w:space="0" w:color="CCCCCC"/>
-            </w:tcBorders>
-            <w:tcMar>
-              <w:top w:w="80" w:type="dxa"/>
-              <w:left w:w="120" w:type="dxa"/>
-              <w:bottom w:w="80" w:type="dxa"/>
-              <w:right w:w="120" w:type="dxa"/>
-            </w:tcMar>
-          </w:tcPr>
-          <w:p>
-            <w:pPr>
-              <w:rPr>
-                <w:rFonts w:ascii="Calibri" w:hAnsi="Calibri" w:cs="Calibri"/>
-              </w:rPr>
-            </w:pPr>
-            <w:r>
-              <w:rPr>
-                <w:rFonts w:ascii="Calibri" w:hAnsi="Calibri" w:cs="Calibri"/>
-              </w:rPr>
-              <w:t>Yes - required</w:t>
-            </w:r>
-          </w:p>
-        </w:tc>
-        <w:tc>
-          <w:tcPr>
-            <w:tcW w:w="2256" w:type="dxa"/>
-            <w:tcBorders>
-              <w:top w:val="single" w:sz="1" w:space="0" w:color="CCCCCC"/>
-              <w:left w:val="single" w:sz="1" w:space="0" w:color="CCCCCC"/>
-              <w:bottom w:val="single" w:sz="1" w:space="0" w:color="CCCCCC"/>
-              <w:right w:val="single" w:sz="1" w:space="0" w:color="CCCCCC"/>
-            </w:tcBorders>
-            <w:tcMar>
-              <w:top w:w="80" w:type="dxa"/>
-              <w:left w:w="120" w:type="dxa"/>
-              <w:bottom w:w="80" w:type="dxa"/>
-              <w:right w:w="120" w:type="dxa"/>
-            </w:tcMar>
-          </w:tcPr>
-          <w:p>
-            <w:pPr>
-              <w:rPr>
-                <w:rFonts w:ascii="Calibri" w:hAnsi="Calibri" w:cs="Calibri"/>
-              </w:rPr>
-            </w:pPr>
-            <w:r>
-              <w:rPr>
-                <w:rFonts w:ascii="Calibri" w:hAnsi="Calibri" w:cs="Calibri"/>
-              </w:rPr>
-              <w:t>Yes - required</w:t>
+            <w:tcW w:w="1800" w:type="dxa"/>
+            <w:tcBorders>
+              <w:top w:val="single" w:sz="1" w:space="0" w:color="CCCCCC"/>
+              <w:left w:val="single" w:sz="1" w:space="0" w:color="CCCCCC"/>
+              <w:bottom w:val="single" w:sz="1" w:space="0" w:color="CCCCCC"/>
+              <w:right w:val="single" w:sz="1" w:space="0" w:color="CCCCCC"/>
+            </w:tcBorders>
+            <w:tcMar>
+              <w:top w:w="80" w:type="dxa"/>
+              <w:left w:w="120" w:type="dxa"/>
+              <w:bottom w:w="80" w:type="dxa"/>
+              <w:right w:w="120" w:type="dxa"/>
+            </w:tcMar>
+          </w:tcPr>
+          <w:p>
+            <w:pPr>
+              <w:rPr>
+                <w:rFonts w:ascii="Calibri" w:hAnsi="Calibri" w:cs="Calibri"/>
+              </w:rPr>
+            </w:pPr>
+            <w:r>
+              <w:rPr>
+                <w:rFonts w:ascii="Calibri" w:hAnsi="Calibri" w:cs="Calibri"/>
+              </w:rPr>
+              <w:t>Who constructs</w:t>
+            </w:r>
+          </w:p>
+        </w:tc>
+        <w:tc>
+          <w:tcPr>
+            <w:tcW w:w="1807" w:type="dxa"/>
+            <w:tcBorders>
+              <w:top w:val="single" w:sz="1" w:space="0" w:color="CCCCCC"/>
+              <w:left w:val="single" w:sz="1" w:space="0" w:color="CCCCCC"/>
+              <w:bottom w:val="single" w:sz="1" w:space="0" w:color="CCCCCC"/>
+              <w:right w:val="single" w:sz="1" w:space="0" w:color="CCCCCC"/>
+            </w:tcBorders>
+            <w:tcMar>
+              <w:top w:w="80" w:type="dxa"/>
+              <w:left w:w="120" w:type="dxa"/>
+              <w:bottom w:w="80" w:type="dxa"/>
+              <w:right w:w="120" w:type="dxa"/>
+            </w:tcMar>
+          </w:tcPr>
+          <w:p>
+            <w:pPr>
+              <w:rPr>
+                <w:rFonts w:ascii="Calibri" w:hAnsi="Calibri" w:cs="Calibri"/>
+              </w:rPr>
+            </w:pPr>
+            <w:r>
+              <w:rPr>
+                <w:rFonts w:ascii="Calibri" w:hAnsi="Calibri" w:cs="Calibri"/>
+              </w:rPr>
+              <w:t>Learner by hand</w:t>
+            </w:r>
+          </w:p>
+        </w:tc>
+        <w:tc>
+          <w:tcPr>
+            <w:tcW w:w="1807" w:type="dxa"/>
+            <w:tcBorders>
+              <w:top w:val="single" w:sz="1" w:space="0" w:color="CCCCCC"/>
+              <w:left w:val="single" w:sz="1" w:space="0" w:color="CCCCCC"/>
+              <w:bottom w:val="single" w:sz="1" w:space="0" w:color="CCCCCC"/>
+              <w:right w:val="single" w:sz="1" w:space="0" w:color="CCCCCC"/>
+            </w:tcBorders>
+            <w:tcMar>
+              <w:top w:w="80" w:type="dxa"/>
+              <w:left w:w="120" w:type="dxa"/>
+              <w:bottom w:w="80" w:type="dxa"/>
+              <w:right w:w="120" w:type="dxa"/>
+            </w:tcMar>
+          </w:tcPr>
+          <w:p>
+            <w:pPr>
+              <w:rPr>
+                <w:rFonts w:ascii="Calibri" w:hAnsi="Calibri" w:cs="Calibri"/>
+              </w:rPr>
+            </w:pPr>
+            <w:r>
+              <w:rPr>
+                <w:rFonts w:ascii="Calibri" w:hAnsi="Calibri" w:cs="Calibri"/>
+              </w:rPr>
+              <w:t>AI tool</w:t>
+            </w:r>
+          </w:p>
+        </w:tc>
+        <w:tc>
+          <w:tcPr>
+            <w:tcW w:w="1806" w:type="dxa"/>
+            <w:tcBorders>
+              <w:top w:val="single" w:sz="1" w:space="0" w:color="CCCCCC"/>
+              <w:left w:val="single" w:sz="1" w:space="0" w:color="CCCCCC"/>
+              <w:bottom w:val="single" w:sz="1" w:space="0" w:color="CCCCCC"/>
+              <w:right w:val="single" w:sz="1" w:space="0" w:color="CCCCCC"/>
+            </w:tcBorders>
+            <w:tcMar>
+              <w:top w:w="80" w:type="dxa"/>
+              <w:left w:w="120" w:type="dxa"/>
+              <w:bottom w:w="80" w:type="dxa"/>
+              <w:right w:w="120" w:type="dxa"/>
+            </w:tcMar>
+          </w:tcPr>
+          <w:p>
+            <w:pPr>
+              <w:rPr>
+                <w:rFonts w:ascii="Calibri" w:hAnsi="Calibri" w:cs="Calibri"/>
+              </w:rPr>
+            </w:pPr>
+            <w:r>
+              <w:rPr>
+                <w:rFonts w:ascii="Calibri" w:hAnsi="Calibri" w:cs="Calibri"/>
+              </w:rPr>
+              <w:t>AI tool</w:t>
+            </w:r>
+          </w:p>
+        </w:tc>
+        <w:tc>
+          <w:tcPr>
+            <w:tcW w:w="1806" w:type="dxa"/>
+            <w:tcBorders>
+              <w:top w:val="single" w:sz="1" w:space="0" w:color="CCCCCC"/>
+              <w:left w:val="single" w:sz="1" w:space="0" w:color="CCCCCC"/>
+              <w:bottom w:val="single" w:sz="1" w:space="0" w:color="CCCCCC"/>
+              <w:right w:val="single" w:sz="1" w:space="0" w:color="CCCCCC"/>
+            </w:tcBorders>
+            <w:tcMar>
+              <w:top w:w="80" w:type="dxa"/>
+              <w:left w:w="120" w:type="dxa"/>
+              <w:bottom w:w="80" w:type="dxa"/>
+              <w:right w:w="120" w:type="dxa"/>
+            </w:tcMar>
+          </w:tcPr>
+          <w:p>
+            <w:pPr>
+              <w:rPr>
+                <w:rFonts w:ascii="Calibri" w:hAnsi="Calibri" w:cs="Calibri"/>
+              </w:rPr>
+            </w:pPr>
+            <w:r>
+              <w:rPr>
+                <w:rFonts w:ascii="Calibri" w:hAnsi="Calibri" w:cs="Calibri"/>
+              </w:rPr>
+              <w:t xml:space="preserve">AI tool</w:t>
             </w:r>
           </w:p>
         </w:tc>
@@ -6705,121 +6804,151 @@
       <w:tr>
         <w:tc>
           <w:tcPr>
-            <w:tcW w:w="2256" w:type="dxa"/>
-            <w:tcBorders>
-              <w:top w:val="single" w:sz="1" w:space="0" w:color="CCCCCC"/>
-              <w:left w:val="single" w:sz="1" w:space="0" w:color="CCCCCC"/>
-              <w:bottom w:val="single" w:sz="1" w:space="0" w:color="CCCCCC"/>
-              <w:right w:val="single" w:sz="1" w:space="0" w:color="CCCCCC"/>
-            </w:tcBorders>
-            <w:tcMar>
-              <w:top w:w="80" w:type="dxa"/>
-              <w:left w:w="120" w:type="dxa"/>
-              <w:bottom w:w="80" w:type="dxa"/>
-              <w:right w:w="120" w:type="dxa"/>
-            </w:tcMar>
-          </w:tcPr>
-          <w:p>
-            <w:pPr>
-              <w:rPr>
-                <w:rFonts w:ascii="Calibri" w:hAnsi="Calibri" w:cs="Calibri"/>
-              </w:rPr>
-            </w:pPr>
-            <w:r>
-              <w:rPr>
-                <w:rFonts w:ascii="Calibri" w:hAnsi="Calibri" w:cs="Calibri"/>
-              </w:rPr>
-              <w:t>Agent Failure Modes list</w:t>
-            </w:r>
-          </w:p>
-        </w:tc>
-        <w:tc>
-          <w:tcPr>
-            <w:tcW w:w="2256" w:type="dxa"/>
-            <w:tcBorders>
-              <w:top w:val="single" w:sz="1" w:space="0" w:color="CCCCCC"/>
-              <w:left w:val="single" w:sz="1" w:space="0" w:color="CCCCCC"/>
-              <w:bottom w:val="single" w:sz="1" w:space="0" w:color="CCCCCC"/>
-              <w:right w:val="single" w:sz="1" w:space="0" w:color="CCCCCC"/>
-            </w:tcBorders>
-            <w:tcMar>
-              <w:top w:w="80" w:type="dxa"/>
-              <w:left w:w="120" w:type="dxa"/>
-              <w:bottom w:w="80" w:type="dxa"/>
-              <w:right w:w="120" w:type="dxa"/>
-            </w:tcMar>
-          </w:tcPr>
-          <w:p>
-            <w:pPr>
-              <w:rPr>
-                <w:rFonts w:ascii="Calibri" w:hAnsi="Calibri" w:cs="Calibri"/>
-              </w:rPr>
-            </w:pPr>
-            <w:r>
-              <w:rPr>
-                <w:rFonts w:ascii="Calibri" w:hAnsi="Calibri" w:cs="Calibri"/>
-              </w:rPr>
-              <w:t>Yes (to guide AI validation)</w:t>
-            </w:r>
-          </w:p>
-        </w:tc>
-        <w:tc>
-          <w:tcPr>
-            <w:tcW w:w="2256" w:type="dxa"/>
-            <w:tcBorders>
-              <w:top w:val="single" w:sz="1" w:space="0" w:color="CCCCCC"/>
-              <w:left w:val="single" w:sz="1" w:space="0" w:color="CCCCCC"/>
-              <w:bottom w:val="single" w:sz="1" w:space="0" w:color="CCCCCC"/>
-              <w:right w:val="single" w:sz="1" w:space="0" w:color="CCCCCC"/>
-            </w:tcBorders>
-            <w:tcMar>
-              <w:top w:w="80" w:type="dxa"/>
-              <w:left w:w="120" w:type="dxa"/>
-              <w:bottom w:w="80" w:type="dxa"/>
-              <w:right w:w="120" w:type="dxa"/>
-            </w:tcMar>
-          </w:tcPr>
-          <w:p>
-            <w:pPr>
-              <w:rPr>
-                <w:rFonts w:ascii="Calibri" w:hAnsi="Calibri" w:cs="Calibri"/>
-              </w:rPr>
-            </w:pPr>
-            <w:r>
-              <w:rPr>
-                <w:rFonts w:ascii="Calibri" w:hAnsi="Calibri" w:cs="Calibri"/>
-              </w:rPr>
-              <w:t>Yes (to guide AI validation)</w:t>
-            </w:r>
-          </w:p>
-        </w:tc>
-        <w:tc>
-          <w:tcPr>
-            <w:tcW w:w="2256" w:type="dxa"/>
-            <w:tcBorders>
-              <w:top w:val="single" w:sz="1" w:space="0" w:color="CCCCCC"/>
-              <w:left w:val="single" w:sz="1" w:space="0" w:color="CCCCCC"/>
-              <w:bottom w:val="single" w:sz="1" w:space="0" w:color="CCCCCC"/>
-              <w:right w:val="single" w:sz="1" w:space="0" w:color="CCCCCC"/>
-            </w:tcBorders>
-            <w:tcMar>
-              <w:top w:w="80" w:type="dxa"/>
-              <w:left w:w="120" w:type="dxa"/>
-              <w:bottom w:w="80" w:type="dxa"/>
-              <w:right w:w="120" w:type="dxa"/>
-            </w:tcMar>
-          </w:tcPr>
-          <w:p>
-            <w:pPr>
-              <w:rPr>
-                <w:rFonts w:ascii="Calibri" w:hAnsi="Calibri" w:cs="Calibri"/>
-              </w:rPr>
-            </w:pPr>
-            <w:r>
-              <w:rPr>
-                <w:rFonts w:ascii="Calibri" w:hAnsi="Calibri" w:cs="Calibri"/>
-              </w:rPr>
-              <w:t>No (learner derives independently)</w:t>
+            <w:tcW w:w="1800" w:type="dxa"/>
+            <w:tcBorders>
+              <w:top w:val="single" w:sz="1" w:space="0" w:color="CCCCCC"/>
+              <w:left w:val="single" w:sz="1" w:space="0" w:color="CCCCCC"/>
+              <w:bottom w:val="single" w:sz="1" w:space="0" w:color="CCCCCC"/>
+              <w:right w:val="single" w:sz="1" w:space="0" w:color="CCCCCC"/>
+            </w:tcBorders>
+            <w:tcMar>
+              <w:top w:w="80" w:type="dxa"/>
+              <w:left w:w="120" w:type="dxa"/>
+              <w:bottom w:w="80" w:type="dxa"/>
+              <w:right w:w="120" w:type="dxa"/>
+            </w:tcMar>
+          </w:tcPr>
+          <w:p>
+            <w:pPr>
+              <w:rPr>
+                <w:rFonts w:ascii="Calibri" w:hAnsi="Calibri" w:cs="Calibri"/>
+              </w:rPr>
+            </w:pPr>
+            <w:r>
+              <w:rPr>
+                <w:rFonts w:ascii="Calibri" w:hAnsi="Calibri" w:cs="Calibri"/>
+              </w:rPr>
+              <w:t>Comprehension Primitive</w:t>
+            </w:r>
+          </w:p>
+        </w:tc>
+        <w:tc>
+          <w:tcPr>
+            <w:tcW w:w="1807" w:type="dxa"/>
+            <w:tcBorders>
+              <w:top w:val="single" w:sz="1" w:space="0" w:color="CCCCCC"/>
+              <w:left w:val="single" w:sz="1" w:space="0" w:color="CCCCCC"/>
+              <w:bottom w:val="single" w:sz="1" w:space="0" w:color="CCCCCC"/>
+              <w:right w:val="single" w:sz="1" w:space="0" w:color="CCCCCC"/>
+            </w:tcBorders>
+            <w:tcMar>
+              <w:top w:w="80" w:type="dxa"/>
+              <w:left w:w="120" w:type="dxa"/>
+              <w:bottom w:w="80" w:type="dxa"/>
+              <w:right w:w="120" w:type="dxa"/>
+            </w:tcMar>
+          </w:tcPr>
+          <w:p>
+            <w:pPr>
+              <w:rPr>
+                <w:rFonts w:ascii="Calibri" w:hAnsi="Calibri" w:cs="Calibri"/>
+              </w:rPr>
+            </w:pPr>
+            <w:r>
+              <w:rPr>
+                <w:rFonts w:ascii="Calibri" w:hAnsi="Calibri" w:cs="Calibri"/>
+              </w:rPr>
+              <w:t>No (learner IS constructing)</w:t>
+            </w:r>
+          </w:p>
+        </w:tc>
+        <w:tc>
+          <w:tcPr>
+            <w:tcW w:w="1807" w:type="dxa"/>
+            <w:tcBorders>
+              <w:top w:val="single" w:sz="1" w:space="0" w:color="CCCCCC"/>
+              <w:left w:val="single" w:sz="1" w:space="0" w:color="CCCCCC"/>
+              <w:bottom w:val="single" w:sz="1" w:space="0" w:color="CCCCCC"/>
+              <w:right w:val="single" w:sz="1" w:space="0" w:color="CCCCCC"/>
+            </w:tcBorders>
+            <w:tcMar>
+              <w:top w:w="80" w:type="dxa"/>
+              <w:left w:w="120" w:type="dxa"/>
+              <w:bottom w:w="80" w:type="dxa"/>
+              <w:right w:w="120" w:type="dxa"/>
+            </w:tcMar>
+          </w:tcPr>
+          <w:p>
+            <w:pPr>
+              <w:rPr>
+                <w:rFonts w:ascii="Calibri" w:hAnsi="Calibri" w:cs="Calibri"/>
+              </w:rPr>
+            </w:pPr>
+            <w:r>
+              <w:rPr>
+                <w:rFonts w:ascii="Calibri" w:hAnsi="Calibri" w:cs="Calibri"/>
+              </w:rPr>
+              <w:t>Yes - required</w:t>
+            </w:r>
+          </w:p>
+        </w:tc>
+        <w:tc>
+          <w:tcPr>
+            <w:tcW w:w="1806" w:type="dxa"/>
+            <w:tcBorders>
+              <w:top w:val="single" w:sz="1" w:space="0" w:color="CCCCCC"/>
+              <w:left w:val="single" w:sz="1" w:space="0" w:color="CCCCCC"/>
+              <w:bottom w:val="single" w:sz="1" w:space="0" w:color="CCCCCC"/>
+              <w:right w:val="single" w:sz="1" w:space="0" w:color="CCCCCC"/>
+            </w:tcBorders>
+            <w:tcMar>
+              <w:top w:w="80" w:type="dxa"/>
+              <w:left w:w="120" w:type="dxa"/>
+              <w:bottom w:w="80" w:type="dxa"/>
+              <w:right w:w="120" w:type="dxa"/>
+            </w:tcMar>
+          </w:tcPr>
+          <w:p>
+            <w:pPr>
+              <w:rPr>
+                <w:rFonts w:ascii="Calibri" w:hAnsi="Calibri" w:cs="Calibri"/>
+              </w:rPr>
+            </w:pPr>
+            <w:r>
+              <w:rPr>
+                <w:rFonts w:ascii="Calibri" w:hAnsi="Calibri" w:cs="Calibri"/>
+              </w:rPr>
+              <w:t>Yes - required</w:t>
+            </w:r>
+          </w:p>
+        </w:tc>
+        <w:tc>
+          <w:tcPr>
+            <w:tcW w:w="1806" w:type="dxa"/>
+            <w:tcBorders>
+              <w:top w:val="single" w:sz="1" w:space="0" w:color="CCCCCC"/>
+              <w:left w:val="single" w:sz="1" w:space="0" w:color="CCCCCC"/>
+              <w:bottom w:val="single" w:sz="1" w:space="0" w:color="CCCCCC"/>
+              <w:right w:val="single" w:sz="1" w:space="0" w:color="CCCCCC"/>
+            </w:tcBorders>
+            <w:tcMar>
+              <w:top w:w="80" w:type="dxa"/>
+              <w:left w:w="120" w:type="dxa"/>
+              <w:bottom w:w="80" w:type="dxa"/>
+              <w:right w:w="120" w:type="dxa"/>
+            </w:tcMar>
+          </w:tcPr>
+          <w:p>
+            <w:pPr>
+              <w:rPr>
+                <w:rFonts w:ascii="Calibri" w:hAnsi="Calibri" w:cs="Calibri"/>
+              </w:rPr>
+            </w:pPr>
+            <w:r>
+              <w:rPr>
+                <w:rFonts w:ascii="Calibri" w:hAnsi="Calibri" w:cs="Calibri"/>
+              </w:rPr>
+              <w:t xml:space="preserve">Yes - required</w:t>
             </w:r>
           </w:p>
         </w:tc>
@@ -6827,121 +6956,151 @@
       <w:tr>
         <w:tc>
           <w:tcPr>
-            <w:tcW w:w="2256" w:type="dxa"/>
-            <w:tcBorders>
-              <w:top w:val="single" w:sz="1" w:space="0" w:color="CCCCCC"/>
-              <w:left w:val="single" w:sz="1" w:space="0" w:color="CCCCCC"/>
-              <w:bottom w:val="single" w:sz="1" w:space="0" w:color="CCCCCC"/>
-              <w:right w:val="single" w:sz="1" w:space="0" w:color="CCCCCC"/>
-            </w:tcBorders>
-            <w:tcMar>
-              <w:top w:w="80" w:type="dxa"/>
-              <w:left w:w="120" w:type="dxa"/>
-              <w:bottom w:w="80" w:type="dxa"/>
-              <w:right w:w="120" w:type="dxa"/>
-            </w:tcMar>
-          </w:tcPr>
-          <w:p>
-            <w:pPr>
-              <w:rPr>
-                <w:rFonts w:ascii="Calibri" w:hAnsi="Calibri" w:cs="Calibri"/>
-              </w:rPr>
-            </w:pPr>
-            <w:r>
-              <w:rPr>
-                <w:rFonts w:ascii="Calibri" w:hAnsi="Calibri" w:cs="Calibri"/>
-              </w:rPr>
-              <w:t>Decision Log entries</w:t>
-            </w:r>
-          </w:p>
-        </w:tc>
-        <w:tc>
-          <w:tcPr>
-            <w:tcW w:w="2256" w:type="dxa"/>
-            <w:tcBorders>
-              <w:top w:val="single" w:sz="1" w:space="0" w:color="CCCCCC"/>
-              <w:left w:val="single" w:sz="1" w:space="0" w:color="CCCCCC"/>
-              <w:bottom w:val="single" w:sz="1" w:space="0" w:color="CCCCCC"/>
-              <w:right w:val="single" w:sz="1" w:space="0" w:color="CCCCCC"/>
-            </w:tcBorders>
-            <w:tcMar>
-              <w:top w:w="80" w:type="dxa"/>
-              <w:left w:w="120" w:type="dxa"/>
-              <w:bottom w:w="80" w:type="dxa"/>
-              <w:right w:w="120" w:type="dxa"/>
-            </w:tcMar>
-          </w:tcPr>
-          <w:p>
-            <w:pPr>
-              <w:rPr>
-                <w:rFonts w:ascii="Calibri" w:hAnsi="Calibri" w:cs="Calibri"/>
-              </w:rPr>
-            </w:pPr>
-            <w:r>
-              <w:rPr>
-                <w:rFonts w:ascii="Calibri" w:hAnsi="Calibri" w:cs="Calibri"/>
-              </w:rPr>
-              <w:t>All AI constructs: pass/fail + defect</w:t>
-            </w:r>
-          </w:p>
-        </w:tc>
-        <w:tc>
-          <w:tcPr>
-            <w:tcW w:w="2256" w:type="dxa"/>
-            <w:tcBorders>
-              <w:top w:val="single" w:sz="1" w:space="0" w:color="CCCCCC"/>
-              <w:left w:val="single" w:sz="1" w:space="0" w:color="CCCCCC"/>
-              <w:bottom w:val="single" w:sz="1" w:space="0" w:color="CCCCCC"/>
-              <w:right w:val="single" w:sz="1" w:space="0" w:color="CCCCCC"/>
-            </w:tcBorders>
-            <w:tcMar>
-              <w:top w:w="80" w:type="dxa"/>
-              <w:left w:w="120" w:type="dxa"/>
-              <w:bottom w:w="80" w:type="dxa"/>
-              <w:right w:w="120" w:type="dxa"/>
-            </w:tcMar>
-          </w:tcPr>
-          <w:p>
-            <w:pPr>
-              <w:rPr>
-                <w:rFonts w:ascii="Calibri" w:hAnsi="Calibri" w:cs="Calibri"/>
-              </w:rPr>
-            </w:pPr>
-            <w:r>
-              <w:rPr>
-                <w:rFonts w:ascii="Calibri" w:hAnsi="Calibri" w:cs="Calibri"/>
-              </w:rPr>
-              <w:t>All constructs: what it does + pass/fail + defect</w:t>
-            </w:r>
-          </w:p>
-        </w:tc>
-        <w:tc>
-          <w:tcPr>
-            <w:tcW w:w="2256" w:type="dxa"/>
-            <w:tcBorders>
-              <w:top w:val="single" w:sz="1" w:space="0" w:color="CCCCCC"/>
-              <w:left w:val="single" w:sz="1" w:space="0" w:color="CCCCCC"/>
-              <w:bottom w:val="single" w:sz="1" w:space="0" w:color="CCCCCC"/>
-              <w:right w:val="single" w:sz="1" w:space="0" w:color="CCCCCC"/>
-            </w:tcBorders>
-            <w:tcMar>
-              <w:top w:w="80" w:type="dxa"/>
-              <w:left w:w="120" w:type="dxa"/>
-              <w:bottom w:w="80" w:type="dxa"/>
-              <w:right w:w="120" w:type="dxa"/>
-            </w:tcMar>
-          </w:tcPr>
-          <w:p>
-            <w:pPr>
-              <w:rPr>
-                <w:rFonts w:ascii="Calibri" w:hAnsi="Calibri" w:cs="Calibri"/>
-              </w:rPr>
-            </w:pPr>
-            <w:r>
-              <w:rPr>
-                <w:rFonts w:ascii="Calibri" w:hAnsi="Calibri" w:cs="Calibri"/>
-              </w:rPr>
-              <w:t>Defects only (passing constructs: pass recorded, no full entry)</w:t>
+            <w:tcW w:w="1800" w:type="dxa"/>
+            <w:tcBorders>
+              <w:top w:val="single" w:sz="1" w:space="0" w:color="CCCCCC"/>
+              <w:left w:val="single" w:sz="1" w:space="0" w:color="CCCCCC"/>
+              <w:bottom w:val="single" w:sz="1" w:space="0" w:color="CCCCCC"/>
+              <w:right w:val="single" w:sz="1" w:space="0" w:color="CCCCCC"/>
+            </w:tcBorders>
+            <w:tcMar>
+              <w:top w:w="80" w:type="dxa"/>
+              <w:left w:w="120" w:type="dxa"/>
+              <w:bottom w:w="80" w:type="dxa"/>
+              <w:right w:w="120" w:type="dxa"/>
+            </w:tcMar>
+          </w:tcPr>
+          <w:p>
+            <w:pPr>
+              <w:rPr>
+                <w:rFonts w:ascii="Calibri" w:hAnsi="Calibri" w:cs="Calibri"/>
+              </w:rPr>
+            </w:pPr>
+            <w:r>
+              <w:rPr>
+                <w:rFonts w:ascii="Calibri" w:hAnsi="Calibri" w:cs="Calibri"/>
+              </w:rPr>
+              <w:t>Agent Failure Modes list</w:t>
+            </w:r>
+          </w:p>
+        </w:tc>
+        <w:tc>
+          <w:tcPr>
+            <w:tcW w:w="1807" w:type="dxa"/>
+            <w:tcBorders>
+              <w:top w:val="single" w:sz="1" w:space="0" w:color="CCCCCC"/>
+              <w:left w:val="single" w:sz="1" w:space="0" w:color="CCCCCC"/>
+              <w:bottom w:val="single" w:sz="1" w:space="0" w:color="CCCCCC"/>
+              <w:right w:val="single" w:sz="1" w:space="0" w:color="CCCCCC"/>
+            </w:tcBorders>
+            <w:tcMar>
+              <w:top w:w="80" w:type="dxa"/>
+              <w:left w:w="120" w:type="dxa"/>
+              <w:bottom w:w="80" w:type="dxa"/>
+              <w:right w:w="120" w:type="dxa"/>
+            </w:tcMar>
+          </w:tcPr>
+          <w:p>
+            <w:pPr>
+              <w:rPr>
+                <w:rFonts w:ascii="Calibri" w:hAnsi="Calibri" w:cs="Calibri"/>
+              </w:rPr>
+            </w:pPr>
+            <w:r>
+              <w:rPr>
+                <w:rFonts w:ascii="Calibri" w:hAnsi="Calibri" w:cs="Calibri"/>
+              </w:rPr>
+              <w:t>Yes (to guide AI validation)</w:t>
+            </w:r>
+          </w:p>
+        </w:tc>
+        <w:tc>
+          <w:tcPr>
+            <w:tcW w:w="1807" w:type="dxa"/>
+            <w:tcBorders>
+              <w:top w:val="single" w:sz="1" w:space="0" w:color="CCCCCC"/>
+              <w:left w:val="single" w:sz="1" w:space="0" w:color="CCCCCC"/>
+              <w:bottom w:val="single" w:sz="1" w:space="0" w:color="CCCCCC"/>
+              <w:right w:val="single" w:sz="1" w:space="0" w:color="CCCCCC"/>
+            </w:tcBorders>
+            <w:tcMar>
+              <w:top w:w="80" w:type="dxa"/>
+              <w:left w:w="120" w:type="dxa"/>
+              <w:bottom w:w="80" w:type="dxa"/>
+              <w:right w:w="120" w:type="dxa"/>
+            </w:tcMar>
+          </w:tcPr>
+          <w:p>
+            <w:pPr>
+              <w:rPr>
+                <w:rFonts w:ascii="Calibri" w:hAnsi="Calibri" w:cs="Calibri"/>
+              </w:rPr>
+            </w:pPr>
+            <w:r>
+              <w:rPr>
+                <w:rFonts w:ascii="Calibri" w:hAnsi="Calibri" w:cs="Calibri"/>
+              </w:rPr>
+              <w:t>Yes (to guide AI validation)</w:t>
+            </w:r>
+          </w:p>
+        </w:tc>
+        <w:tc>
+          <w:tcPr>
+            <w:tcW w:w="1806" w:type="dxa"/>
+            <w:tcBorders>
+              <w:top w:val="single" w:sz="1" w:space="0" w:color="CCCCCC"/>
+              <w:left w:val="single" w:sz="1" w:space="0" w:color="CCCCCC"/>
+              <w:bottom w:val="single" w:sz="1" w:space="0" w:color="CCCCCC"/>
+              <w:right w:val="single" w:sz="1" w:space="0" w:color="CCCCCC"/>
+            </w:tcBorders>
+            <w:tcMar>
+              <w:top w:w="80" w:type="dxa"/>
+              <w:left w:w="120" w:type="dxa"/>
+              <w:bottom w:w="80" w:type="dxa"/>
+              <w:right w:w="120" w:type="dxa"/>
+            </w:tcMar>
+          </w:tcPr>
+          <w:p>
+            <w:pPr>
+              <w:rPr>
+                <w:rFonts w:ascii="Calibri" w:hAnsi="Calibri" w:cs="Calibri"/>
+              </w:rPr>
+            </w:pPr>
+            <w:r>
+              <w:rPr>
+                <w:rFonts w:ascii="Calibri" w:hAnsi="Calibri" w:cs="Calibri"/>
+              </w:rPr>
+              <w:t>No (learner derives independently)</w:t>
+            </w:r>
+          </w:p>
+        </w:tc>
+        <w:tc>
+          <w:tcPr>
+            <w:tcW w:w="1806" w:type="dxa"/>
+            <w:tcBorders>
+              <w:top w:val="single" w:sz="1" w:space="0" w:color="CCCCCC"/>
+              <w:left w:val="single" w:sz="1" w:space="0" w:color="CCCCCC"/>
+              <w:bottom w:val="single" w:sz="1" w:space="0" w:color="CCCCCC"/>
+              <w:right w:val="single" w:sz="1" w:space="0" w:color="CCCCCC"/>
+            </w:tcBorders>
+            <w:tcMar>
+              <w:top w:w="80" w:type="dxa"/>
+              <w:left w:w="120" w:type="dxa"/>
+              <w:bottom w:w="80" w:type="dxa"/>
+              <w:right w:w="120" w:type="dxa"/>
+            </w:tcMar>
+          </w:tcPr>
+          <w:p>
+            <w:pPr>
+              <w:rPr>
+                <w:rFonts w:ascii="Calibri" w:hAnsi="Calibri" w:cs="Calibri"/>
+              </w:rPr>
+            </w:pPr>
+            <w:r>
+              <w:rPr>
+                <w:rFonts w:ascii="Calibri" w:hAnsi="Calibri" w:cs="Calibri"/>
+              </w:rPr>
+              <w:t xml:space="preserve">No (same as Mode 3)</w:t>
             </w:r>
           </w:p>
         </w:tc>
@@ -6949,121 +7108,151 @@
       <w:tr>
         <w:tc>
           <w:tcPr>
-            <w:tcW w:w="2256" w:type="dxa"/>
-            <w:tcBorders>
-              <w:top w:val="single" w:sz="1" w:space="0" w:color="CCCCCC"/>
-              <w:left w:val="single" w:sz="1" w:space="0" w:color="CCCCCC"/>
-              <w:bottom w:val="single" w:sz="1" w:space="0" w:color="CCCCCC"/>
-              <w:right w:val="single" w:sz="1" w:space="0" w:color="CCCCCC"/>
-            </w:tcBorders>
-            <w:tcMar>
-              <w:top w:w="80" w:type="dxa"/>
-              <w:left w:w="120" w:type="dxa"/>
-              <w:bottom w:w="80" w:type="dxa"/>
-              <w:right w:w="120" w:type="dxa"/>
-            </w:tcMar>
-          </w:tcPr>
-          <w:p>
-            <w:pPr>
-              <w:rPr>
-                <w:rFonts w:ascii="Calibri" w:hAnsi="Calibri" w:cs="Calibri"/>
-              </w:rPr>
-            </w:pPr>
-            <w:r>
-              <w:rPr>
-                <w:rFonts w:ascii="Calibri" w:hAnsi="Calibri" w:cs="Calibri"/>
-              </w:rPr>
-              <w:t>What ships</w:t>
-            </w:r>
-          </w:p>
-        </w:tc>
-        <w:tc>
-          <w:tcPr>
-            <w:tcW w:w="2256" w:type="dxa"/>
-            <w:tcBorders>
-              <w:top w:val="single" w:sz="1" w:space="0" w:color="CCCCCC"/>
-              <w:left w:val="single" w:sz="1" w:space="0" w:color="CCCCCC"/>
-              <w:bottom w:val="single" w:sz="1" w:space="0" w:color="CCCCCC"/>
-              <w:right w:val="single" w:sz="1" w:space="0" w:color="CCCCCC"/>
-            </w:tcBorders>
-            <w:tcMar>
-              <w:top w:w="80" w:type="dxa"/>
-              <w:left w:w="120" w:type="dxa"/>
-              <w:bottom w:w="80" w:type="dxa"/>
-              <w:right w:w="120" w:type="dxa"/>
-            </w:tcMar>
-          </w:tcPr>
-          <w:p>
-            <w:pPr>
-              <w:rPr>
-                <w:rFonts w:ascii="Calibri" w:hAnsi="Calibri" w:cs="Calibri"/>
-              </w:rPr>
-            </w:pPr>
-            <w:r>
-              <w:rPr>
-                <w:rFonts w:ascii="Calibri" w:hAnsi="Calibri" w:cs="Calibri"/>
-              </w:rPr>
-              <w:t>Learner's hand-built artifact</w:t>
-            </w:r>
-          </w:p>
-        </w:tc>
-        <w:tc>
-          <w:tcPr>
-            <w:tcW w:w="2256" w:type="dxa"/>
-            <w:tcBorders>
-              <w:top w:val="single" w:sz="1" w:space="0" w:color="CCCCCC"/>
-              <w:left w:val="single" w:sz="1" w:space="0" w:color="CCCCCC"/>
-              <w:bottom w:val="single" w:sz="1" w:space="0" w:color="CCCCCC"/>
-              <w:right w:val="single" w:sz="1" w:space="0" w:color="CCCCCC"/>
-            </w:tcBorders>
-            <w:tcMar>
-              <w:top w:w="80" w:type="dxa"/>
-              <w:left w:w="120" w:type="dxa"/>
-              <w:bottom w:w="80" w:type="dxa"/>
-              <w:right w:w="120" w:type="dxa"/>
-            </w:tcMar>
-          </w:tcPr>
-          <w:p>
-            <w:pPr>
-              <w:rPr>
-                <w:rFonts w:ascii="Calibri" w:hAnsi="Calibri" w:cs="Calibri"/>
-              </w:rPr>
-            </w:pPr>
-            <w:r>
-              <w:rPr>
-                <w:rFonts w:ascii="Calibri" w:hAnsi="Calibri" w:cs="Calibri"/>
-              </w:rPr>
-              <w:t>Corrected AI output</w:t>
-            </w:r>
-          </w:p>
-        </w:tc>
-        <w:tc>
-          <w:tcPr>
-            <w:tcW w:w="2256" w:type="dxa"/>
-            <w:tcBorders>
-              <w:top w:val="single" w:sz="1" w:space="0" w:color="CCCCCC"/>
-              <w:left w:val="single" w:sz="1" w:space="0" w:color="CCCCCC"/>
-              <w:bottom w:val="single" w:sz="1" w:space="0" w:color="CCCCCC"/>
-              <w:right w:val="single" w:sz="1" w:space="0" w:color="CCCCCC"/>
-            </w:tcBorders>
-            <w:tcMar>
-              <w:top w:w="80" w:type="dxa"/>
-              <w:left w:w="120" w:type="dxa"/>
-              <w:bottom w:w="80" w:type="dxa"/>
-              <w:right w:w="120" w:type="dxa"/>
-            </w:tcMar>
-          </w:tcPr>
-          <w:p>
-            <w:pPr>
-              <w:rPr>
-                <w:rFonts w:ascii="Calibri" w:hAnsi="Calibri" w:cs="Calibri"/>
-              </w:rPr>
-            </w:pPr>
-            <w:r>
-              <w:rPr>
-                <w:rFonts w:ascii="Calibri" w:hAnsi="Calibri" w:cs="Calibri"/>
-              </w:rPr>
-              <w:t>Corrected AI output</w:t>
+            <w:tcW w:w="1800" w:type="dxa"/>
+            <w:tcBorders>
+              <w:top w:val="single" w:sz="1" w:space="0" w:color="CCCCCC"/>
+              <w:left w:val="single" w:sz="1" w:space="0" w:color="CCCCCC"/>
+              <w:bottom w:val="single" w:sz="1" w:space="0" w:color="CCCCCC"/>
+              <w:right w:val="single" w:sz="1" w:space="0" w:color="CCCCCC"/>
+            </w:tcBorders>
+            <w:tcMar>
+              <w:top w:w="80" w:type="dxa"/>
+              <w:left w:w="120" w:type="dxa"/>
+              <w:bottom w:w="80" w:type="dxa"/>
+              <w:right w:w="120" w:type="dxa"/>
+            </w:tcMar>
+          </w:tcPr>
+          <w:p>
+            <w:pPr>
+              <w:rPr>
+                <w:rFonts w:ascii="Calibri" w:hAnsi="Calibri" w:cs="Calibri"/>
+              </w:rPr>
+            </w:pPr>
+            <w:r>
+              <w:rPr>
+                <w:rFonts w:ascii="Calibri" w:hAnsi="Calibri" w:cs="Calibri"/>
+              </w:rPr>
+              <w:t>Decision Log entries</w:t>
+            </w:r>
+          </w:p>
+        </w:tc>
+        <w:tc>
+          <w:tcPr>
+            <w:tcW w:w="1807" w:type="dxa"/>
+            <w:tcBorders>
+              <w:top w:val="single" w:sz="1" w:space="0" w:color="CCCCCC"/>
+              <w:left w:val="single" w:sz="1" w:space="0" w:color="CCCCCC"/>
+              <w:bottom w:val="single" w:sz="1" w:space="0" w:color="CCCCCC"/>
+              <w:right w:val="single" w:sz="1" w:space="0" w:color="CCCCCC"/>
+            </w:tcBorders>
+            <w:tcMar>
+              <w:top w:w="80" w:type="dxa"/>
+              <w:left w:w="120" w:type="dxa"/>
+              <w:bottom w:w="80" w:type="dxa"/>
+              <w:right w:w="120" w:type="dxa"/>
+            </w:tcMar>
+          </w:tcPr>
+          <w:p>
+            <w:pPr>
+              <w:rPr>
+                <w:rFonts w:ascii="Calibri" w:hAnsi="Calibri" w:cs="Calibri"/>
+              </w:rPr>
+            </w:pPr>
+            <w:r>
+              <w:rPr>
+                <w:rFonts w:ascii="Calibri" w:hAnsi="Calibri" w:cs="Calibri"/>
+              </w:rPr>
+              <w:t>All AI constructs: pass/fail + defect</w:t>
+            </w:r>
+          </w:p>
+        </w:tc>
+        <w:tc>
+          <w:tcPr>
+            <w:tcW w:w="1807" w:type="dxa"/>
+            <w:tcBorders>
+              <w:top w:val="single" w:sz="1" w:space="0" w:color="CCCCCC"/>
+              <w:left w:val="single" w:sz="1" w:space="0" w:color="CCCCCC"/>
+              <w:bottom w:val="single" w:sz="1" w:space="0" w:color="CCCCCC"/>
+              <w:right w:val="single" w:sz="1" w:space="0" w:color="CCCCCC"/>
+            </w:tcBorders>
+            <w:tcMar>
+              <w:top w:w="80" w:type="dxa"/>
+              <w:left w:w="120" w:type="dxa"/>
+              <w:bottom w:w="80" w:type="dxa"/>
+              <w:right w:w="120" w:type="dxa"/>
+            </w:tcMar>
+          </w:tcPr>
+          <w:p>
+            <w:pPr>
+              <w:rPr>
+                <w:rFonts w:ascii="Calibri" w:hAnsi="Calibri" w:cs="Calibri"/>
+              </w:rPr>
+            </w:pPr>
+            <w:r>
+              <w:rPr>
+                <w:rFonts w:ascii="Calibri" w:hAnsi="Calibri" w:cs="Calibri"/>
+              </w:rPr>
+              <w:t>All constructs: what it does + pass/fail + defect</w:t>
+            </w:r>
+          </w:p>
+        </w:tc>
+        <w:tc>
+          <w:tcPr>
+            <w:tcW w:w="1806" w:type="dxa"/>
+            <w:tcBorders>
+              <w:top w:val="single" w:sz="1" w:space="0" w:color="CCCCCC"/>
+              <w:left w:val="single" w:sz="1" w:space="0" w:color="CCCCCC"/>
+              <w:bottom w:val="single" w:sz="1" w:space="0" w:color="CCCCCC"/>
+              <w:right w:val="single" w:sz="1" w:space="0" w:color="CCCCCC"/>
+            </w:tcBorders>
+            <w:tcMar>
+              <w:top w:w="80" w:type="dxa"/>
+              <w:left w:w="120" w:type="dxa"/>
+              <w:bottom w:w="80" w:type="dxa"/>
+              <w:right w:w="120" w:type="dxa"/>
+            </w:tcMar>
+          </w:tcPr>
+          <w:p>
+            <w:pPr>
+              <w:rPr>
+                <w:rFonts w:ascii="Calibri" w:hAnsi="Calibri" w:cs="Calibri"/>
+              </w:rPr>
+            </w:pPr>
+            <w:r>
+              <w:rPr>
+                <w:rFonts w:ascii="Calibri" w:hAnsi="Calibri" w:cs="Calibri"/>
+              </w:rPr>
+              <w:t>Defects only (passing constructs: pass recorded, no full entry)</w:t>
+            </w:r>
+          </w:p>
+        </w:tc>
+        <w:tc>
+          <w:tcPr>
+            <w:tcW w:w="1806" w:type="dxa"/>
+            <w:tcBorders>
+              <w:top w:val="single" w:sz="1" w:space="0" w:color="CCCCCC"/>
+              <w:left w:val="single" w:sz="1" w:space="0" w:color="CCCCCC"/>
+              <w:bottom w:val="single" w:sz="1" w:space="0" w:color="CCCCCC"/>
+              <w:right w:val="single" w:sz="1" w:space="0" w:color="CCCCCC"/>
+            </w:tcBorders>
+            <w:tcMar>
+              <w:top w:w="80" w:type="dxa"/>
+              <w:left w:w="120" w:type="dxa"/>
+              <w:bottom w:w="80" w:type="dxa"/>
+              <w:right w:w="120" w:type="dxa"/>
+            </w:tcMar>
+          </w:tcPr>
+          <w:p>
+            <w:pPr>
+              <w:rPr>
+                <w:rFonts w:ascii="Calibri" w:hAnsi="Calibri" w:cs="Calibri"/>
+              </w:rPr>
+            </w:pPr>
+            <w:r>
+              <w:rPr>
+                <w:rFonts w:ascii="Calibri" w:hAnsi="Calibri" w:cs="Calibri"/>
+              </w:rPr>
+              <w:t xml:space="preserve">Defects only (passing constructs: pass recorded, no full entry) - same as Mode 3</w:t>
             </w:r>
           </w:p>
         </w:tc>
@@ -7071,7 +7260,159 @@
       <w:tr>
         <w:tc>
           <w:tcPr>
-            <w:tcW w:w="2256" w:type="dxa"/>
+            <w:tcW w:w="1800" w:type="dxa"/>
+            <w:tcBorders>
+              <w:top w:val="single" w:sz="1" w:space="0" w:color="CCCCCC"/>
+              <w:left w:val="single" w:sz="1" w:space="0" w:color="CCCCCC"/>
+              <w:bottom w:val="single" w:sz="1" w:space="0" w:color="CCCCCC"/>
+              <w:right w:val="single" w:sz="1" w:space="0" w:color="CCCCCC"/>
+            </w:tcBorders>
+            <w:tcMar>
+              <w:top w:w="80" w:type="dxa"/>
+              <w:left w:w="120" w:type="dxa"/>
+              <w:bottom w:w="80" w:type="dxa"/>
+              <w:right w:w="120" w:type="dxa"/>
+            </w:tcMar>
+          </w:tcPr>
+          <w:p>
+            <w:pPr>
+              <w:rPr>
+                <w:rFonts w:ascii="Calibri" w:hAnsi="Calibri" w:cs="Calibri"/>
+              </w:rPr>
+            </w:pPr>
+            <w:r>
+              <w:rPr>
+                <w:rFonts w:ascii="Calibri" w:hAnsi="Calibri" w:cs="Calibri"/>
+              </w:rPr>
+              <w:t>What ships</w:t>
+            </w:r>
+          </w:p>
+        </w:tc>
+        <w:tc>
+          <w:tcPr>
+            <w:tcW w:w="1807" w:type="dxa"/>
+            <w:tcBorders>
+              <w:top w:val="single" w:sz="1" w:space="0" w:color="CCCCCC"/>
+              <w:left w:val="single" w:sz="1" w:space="0" w:color="CCCCCC"/>
+              <w:bottom w:val="single" w:sz="1" w:space="0" w:color="CCCCCC"/>
+              <w:right w:val="single" w:sz="1" w:space="0" w:color="CCCCCC"/>
+            </w:tcBorders>
+            <w:tcMar>
+              <w:top w:w="80" w:type="dxa"/>
+              <w:left w:w="120" w:type="dxa"/>
+              <w:bottom w:w="80" w:type="dxa"/>
+              <w:right w:w="120" w:type="dxa"/>
+            </w:tcMar>
+          </w:tcPr>
+          <w:p>
+            <w:pPr>
+              <w:rPr>
+                <w:rFonts w:ascii="Calibri" w:hAnsi="Calibri" w:cs="Calibri"/>
+              </w:rPr>
+            </w:pPr>
+            <w:r>
+              <w:rPr>
+                <w:rFonts w:ascii="Calibri" w:hAnsi="Calibri" w:cs="Calibri"/>
+              </w:rPr>
+              <w:t>Learner's hand-built artifact</w:t>
+            </w:r>
+          </w:p>
+        </w:tc>
+        <w:tc>
+          <w:tcPr>
+            <w:tcW w:w="1807" w:type="dxa"/>
+            <w:tcBorders>
+              <w:top w:val="single" w:sz="1" w:space="0" w:color="CCCCCC"/>
+              <w:left w:val="single" w:sz="1" w:space="0" w:color="CCCCCC"/>
+              <w:bottom w:val="single" w:sz="1" w:space="0" w:color="CCCCCC"/>
+              <w:right w:val="single" w:sz="1" w:space="0" w:color="CCCCCC"/>
+            </w:tcBorders>
+            <w:tcMar>
+              <w:top w:w="80" w:type="dxa"/>
+              <w:left w:w="120" w:type="dxa"/>
+              <w:bottom w:w="80" w:type="dxa"/>
+              <w:right w:w="120" w:type="dxa"/>
+            </w:tcMar>
+          </w:tcPr>
+          <w:p>
+            <w:pPr>
+              <w:rPr>
+                <w:rFonts w:ascii="Calibri" w:hAnsi="Calibri" w:cs="Calibri"/>
+              </w:rPr>
+            </w:pPr>
+            <w:r>
+              <w:rPr>
+                <w:rFonts w:ascii="Calibri" w:hAnsi="Calibri" w:cs="Calibri"/>
+              </w:rPr>
+              <w:t>Corrected AI output</w:t>
+            </w:r>
+          </w:p>
+        </w:tc>
+        <w:tc>
+          <w:tcPr>
+            <w:tcW w:w="1806" w:type="dxa"/>
+            <w:tcBorders>
+              <w:top w:val="single" w:sz="1" w:space="0" w:color="CCCCCC"/>
+              <w:left w:val="single" w:sz="1" w:space="0" w:color="CCCCCC"/>
+              <w:bottom w:val="single" w:sz="1" w:space="0" w:color="CCCCCC"/>
+              <w:right w:val="single" w:sz="1" w:space="0" w:color="CCCCCC"/>
+            </w:tcBorders>
+            <w:tcMar>
+              <w:top w:w="80" w:type="dxa"/>
+              <w:left w:w="120" w:type="dxa"/>
+              <w:bottom w:w="80" w:type="dxa"/>
+              <w:right w:w="120" w:type="dxa"/>
+            </w:tcMar>
+          </w:tcPr>
+          <w:p>
+            <w:pPr>
+              <w:rPr>
+                <w:rFonts w:ascii="Calibri" w:hAnsi="Calibri" w:cs="Calibri"/>
+              </w:rPr>
+            </w:pPr>
+            <w:r>
+              <w:rPr>
+                <w:rFonts w:ascii="Calibri" w:hAnsi="Calibri" w:cs="Calibri"/>
+              </w:rPr>
+              <w:t>Corrected AI output</w:t>
+            </w:r>
+          </w:p>
+        </w:tc>
+        <w:tc>
+          <w:tcPr>
+            <w:tcW w:w="1806" w:type="dxa"/>
+            <w:tcBorders>
+              <w:top w:val="single" w:sz="1" w:space="0" w:color="CCCCCC"/>
+              <w:left w:val="single" w:sz="1" w:space="0" w:color="CCCCCC"/>
+              <w:bottom w:val="single" w:sz="1" w:space="0" w:color="CCCCCC"/>
+              <w:right w:val="single" w:sz="1" w:space="0" w:color="CCCCCC"/>
+            </w:tcBorders>
+            <w:tcMar>
+              <w:top w:w="80" w:type="dxa"/>
+              <w:left w:w="120" w:type="dxa"/>
+              <w:bottom w:w="80" w:type="dxa"/>
+              <w:right w:w="120" w:type="dxa"/>
+            </w:tcMar>
+          </w:tcPr>
+          <w:p>
+            <w:pPr>
+              <w:rPr>
+                <w:rFonts w:ascii="Calibri" w:hAnsi="Calibri" w:cs="Calibri"/>
+              </w:rPr>
+            </w:pPr>
+            <w:r>
+              <w:rPr>
+                <w:rFonts w:ascii="Calibri" w:hAnsi="Calibri" w:cs="Calibri"/>
+              </w:rPr>
+              <w:t xml:space="preserve">Corrected AI output</w:t>
+            </w:r>
+          </w:p>
+        </w:tc>
+      </w:tr>
+      <w:tr>
+        <w:tc>
+          <w:tcPr>
+            <w:tcW w:w="1800" w:type="dxa"/>
             <w:tcBorders>
               <w:top w:val="single" w:sz="1" w:space="0" w:color="CCCCCC"/>
               <w:left w:val="single" w:sz="1" w:space="0" w:color="CCCCCC"/>
@@ -7101,7 +7442,7 @@
         </w:tc>
         <w:tc>
           <w:tcPr>
-            <w:tcW w:w="2256" w:type="dxa"/>
+            <w:tcW w:w="1807" w:type="dxa"/>
             <w:tcBorders>
               <w:top w:val="single" w:sz="1" w:space="0" w:color="CCCCCC"/>
               <w:left w:val="single" w:sz="1" w:space="0" w:color="CCCCCC"/>
@@ -7131,7 +7472,7 @@
         </w:tc>
         <w:tc>
           <w:tcPr>
-            <w:tcW w:w="2256" w:type="dxa"/>
+            <w:tcW w:w="1807" w:type="dxa"/>
             <w:tcBorders>
               <w:top w:val="single" w:sz="1" w:space="0" w:color="CCCCCC"/>
               <w:left w:val="single" w:sz="1" w:space="0" w:color="CCCCCC"/>
@@ -7161,7 +7502,7 @@
         </w:tc>
         <w:tc>
           <w:tcPr>
-            <w:tcW w:w="2256" w:type="dxa"/>
+            <w:tcW w:w="1806" w:type="dxa"/>
             <w:tcBorders>
               <w:top w:val="single" w:sz="1" w:space="0" w:color="CCCCCC"/>
               <w:left w:val="single" w:sz="1" w:space="0" w:color="CCCCCC"/>
@@ -7186,6 +7527,36 @@
                 <w:rFonts w:ascii="Calibri" w:hAnsi="Calibri" w:cs="Calibri"/>
               </w:rPr>
               <w:t>Validation against spec</w:t>
+            </w:r>
+          </w:p>
+        </w:tc>
+        <w:tc>
+          <w:tcPr>
+            <w:tcW w:w="1806" w:type="dxa"/>
+            <w:tcBorders>
+              <w:top w:val="single" w:sz="1" w:space="0" w:color="CCCCCC"/>
+              <w:left w:val="single" w:sz="1" w:space="0" w:color="CCCCCC"/>
+              <w:bottom w:val="single" w:sz="1" w:space="0" w:color="CCCCCC"/>
+              <w:right w:val="single" w:sz="1" w:space="0" w:color="CCCCCC"/>
+            </w:tcBorders>
+            <w:tcMar>
+              <w:top w:w="80" w:type="dxa"/>
+              <w:left w:w="120" w:type="dxa"/>
+              <w:bottom w:w="80" w:type="dxa"/>
+              <w:right w:w="120" w:type="dxa"/>
+            </w:tcMar>
+          </w:tcPr>
+          <w:p>
+            <w:pPr>
+              <w:rPr>
+                <w:rFonts w:ascii="Calibri" w:hAnsi="Calibri" w:cs="Calibri"/>
+              </w:rPr>
+            </w:pPr>
+            <w:r>
+              <w:rPr>
+                <w:rFonts w:ascii="Calibri" w:hAnsi="Calibri" w:cs="Calibri"/>
+              </w:rPr>
+              <w:t xml:space="preserve">Validation against spec (same as Mode 3)</w:t>
             </w:r>
           </w:p>
         </w:tc>
@@ -7198,16 +7569,6 @@
           <w:rFonts w:ascii="Calibri" w:hAnsi="Calibri" w:cs="Calibri"/>
         </w:rPr>
       </w:pPr>
-    </w:p>
-    <w:p>
-      <w:pPr/>
-      <w:r>
-        <w:rPr>
-          <w:rFonts w:ascii="Calibri" w:hAnsi="Calibri"/>
-          <w:b w:val="0"/>
-        </w:rPr>
-        <w:t>Mode 4 is not shown as a column above because, on every dimension in this table, it is identical to Mode 3: same construction actor, same Comprehension Primitive requirement, no Agent Failure Modes list, same Decision Log rules, same artifact shipped, same primary cognitive activity in Validate. The one dimension this table does not capture is who authors the spec: Modes 1 through 3 all require learner authorship; Mode 4 has the AI tool draft it, with the learner reviewing and finalizing it before it directs construction.</w:t>
-      </w:r>
     </w:p>
     <w:p>
       <w:pPr>

</xml_diff>